<commit_message>
Correciones de formato y limpieza
</commit_message>
<xml_diff>
--- a/A3_LVMS.docx
+++ b/A3_LVMS.docx
@@ -2161,6 +2161,144 @@
         </w:rPr>
         <w:t>Esto me permitirá comprender de manera más profunda la lógica detrás de las operaciones con conjuntos, en lugar de depender únicamente de las herramientas ya implementadas en el lenguaje.</w:t>
       </w:r>
+    </w:p>
+    <w:p>
+      <w:pPr>
+        <w:pStyle w:val="Prrafodelista"/>
+        <w:spacing w:after="0" w:line="276" w:lineRule="auto"/>
+        <w:rPr>
+          <w:rFonts w:ascii="Arial" w:eastAsia="Calibri" w:hAnsi="Arial" w:cs="Arial"/>
+          <w:sz w:val="24"/>
+          <w:szCs w:val="24"/>
+          <w:lang w:val="es-MX"/>
+        </w:rPr>
+      </w:pPr>
+    </w:p>
+    <w:p>
+      <w:pPr>
+        <w:pStyle w:val="Prrafodelista"/>
+        <w:spacing w:after="0" w:line="276" w:lineRule="auto"/>
+        <w:rPr>
+          <w:rFonts w:ascii="Arial" w:eastAsia="Calibri" w:hAnsi="Arial" w:cs="Arial"/>
+          <w:sz w:val="24"/>
+          <w:szCs w:val="24"/>
+          <w:lang w:val="es-MX"/>
+        </w:rPr>
+      </w:pPr>
+      <w:r>
+        <w:rPr>
+          <w:rFonts w:ascii="Arial" w:eastAsia="Calibri" w:hAnsi="Arial" w:cs="Arial"/>
+          <w:sz w:val="24"/>
+          <w:szCs w:val="24"/>
+          <w:lang w:val="es-MX"/>
+        </w:rPr>
+        <w:t>Para mantener la legibilidad del código, implementaré programación orientada a objetos y declararé una clase donde se solicite el conjunto universo y se agreguen los métodos para las operaciones. La clase solo podrá manejar dos conjuntos y su conjunto universo.</w:t>
+      </w:r>
+    </w:p>
+    <w:p>
+      <w:pPr>
+        <w:pStyle w:val="Prrafodelista"/>
+        <w:spacing w:after="0" w:line="276" w:lineRule="auto"/>
+        <w:rPr>
+          <w:rFonts w:ascii="Arial" w:eastAsia="Calibri" w:hAnsi="Arial" w:cs="Arial"/>
+          <w:sz w:val="24"/>
+          <w:szCs w:val="24"/>
+          <w:lang w:val="es-MX"/>
+        </w:rPr>
+      </w:pPr>
+    </w:p>
+    <w:p>
+      <w:pPr>
+        <w:pStyle w:val="Prrafodelista"/>
+        <w:spacing w:after="0" w:line="276" w:lineRule="auto"/>
+        <w:rPr>
+          <w:rFonts w:ascii="Arial" w:eastAsia="Calibri" w:hAnsi="Arial" w:cs="Arial"/>
+          <w:sz w:val="24"/>
+          <w:szCs w:val="24"/>
+          <w:lang w:val="es-MX"/>
+        </w:rPr>
+      </w:pPr>
+      <w:r>
+        <w:rPr>
+          <w:rFonts w:ascii="Arial" w:eastAsia="Calibri" w:hAnsi="Arial" w:cs="Arial"/>
+          <w:sz w:val="24"/>
+          <w:szCs w:val="24"/>
+          <w:lang w:val="es-MX"/>
+        </w:rPr>
+        <w:t xml:space="preserve">Primero definimos que </w:t>
+      </w:r>
+    </w:p>
+    <w:p>
+      <w:pPr>
+        <w:pStyle w:val="Prrafodelista"/>
+        <w:spacing w:after="0" w:line="276" w:lineRule="auto"/>
+        <w:rPr>
+          <w:rFonts w:ascii="Arial" w:eastAsia="Calibri" w:hAnsi="Arial" w:cs="Arial"/>
+          <w:sz w:val="24"/>
+          <w:szCs w:val="24"/>
+          <w:lang w:val="es-MX"/>
+        </w:rPr>
+      </w:pPr>
+    </w:p>
+    <w:p>
+      <w:pPr>
+        <w:pStyle w:val="Prrafodelista"/>
+        <w:spacing w:after="0" w:line="276" w:lineRule="auto"/>
+        <w:rPr>
+          <w:rFonts w:ascii="Arial" w:eastAsia="Calibri" w:hAnsi="Arial" w:cs="Arial"/>
+          <w:sz w:val="24"/>
+          <w:szCs w:val="24"/>
+          <w:lang w:val="es-MX"/>
+        </w:rPr>
+      </w:pPr>
+    </w:p>
+    <w:p>
+      <w:pPr>
+        <w:pStyle w:val="Prrafodelista"/>
+        <w:spacing w:after="0" w:line="276" w:lineRule="auto"/>
+        <w:rPr>
+          <w:rFonts w:ascii="Arial" w:eastAsia="Calibri" w:hAnsi="Arial" w:cs="Arial"/>
+          <w:sz w:val="24"/>
+          <w:szCs w:val="24"/>
+          <w:lang w:val="es-MX"/>
+        </w:rPr>
+      </w:pPr>
+    </w:p>
+    <w:p>
+      <w:pPr>
+        <w:pStyle w:val="Prrafodelista"/>
+        <w:spacing w:after="0" w:line="276" w:lineRule="auto"/>
+        <w:rPr>
+          <w:rFonts w:ascii="Arial" w:eastAsia="Calibri" w:hAnsi="Arial" w:cs="Arial"/>
+          <w:sz w:val="24"/>
+          <w:szCs w:val="24"/>
+          <w:lang w:val="es-MX"/>
+        </w:rPr>
+      </w:pPr>
+    </w:p>
+    <w:p>
+      <w:pPr>
+        <w:pStyle w:val="Prrafodelista"/>
+        <w:spacing w:after="0" w:line="276" w:lineRule="auto"/>
+        <w:rPr>
+          <w:rFonts w:ascii="Arial" w:eastAsia="Calibri" w:hAnsi="Arial" w:cs="Arial"/>
+          <w:sz w:val="24"/>
+          <w:szCs w:val="24"/>
+          <w:lang w:val="es-MX"/>
+        </w:rPr>
+      </w:pPr>
+    </w:p>
+    <w:p>
+      <w:pPr>
+        <w:pStyle w:val="Prrafodelista"/>
+        <w:spacing w:after="0" w:line="276" w:lineRule="auto"/>
+        <w:rPr>
+          <w:rFonts w:ascii="Arial" w:eastAsia="Calibri" w:hAnsi="Arial" w:cs="Arial"/>
+          <w:sz w:val="24"/>
+          <w:szCs w:val="24"/>
+          <w:lang w:val="es-MX"/>
+        </w:rPr>
+      </w:pPr>
     </w:p>
     <w:p>
       <w:pPr>

</xml_diff>

<commit_message>
Se terminan todos los metodos de las operaciones de conjuntos
</commit_message>
<xml_diff>
--- a/A3_LVMS.docx
+++ b/A3_LVMS.docx
@@ -714,7 +714,6 @@
           <m:r>
             <w:rPr>
               <w:rFonts w:ascii="Arial" w:eastAsia="Calibri" w:hAnsi="Arial" w:cs="Arial"/>
-              <w:i/>
               <w:sz w:val="24"/>
               <w:szCs w:val="24"/>
             </w:rPr>
@@ -834,7 +833,6 @@
           <m:r>
             <w:rPr>
               <w:rFonts w:ascii="Arial" w:eastAsia="Calibri" w:hAnsi="Arial" w:cs="Arial"/>
-              <w:i/>
               <w:sz w:val="24"/>
               <w:szCs w:val="24"/>
               <w:lang w:val="es-MX"/>
@@ -1298,7 +1296,6 @@
           <m:r>
             <w:rPr>
               <w:rFonts w:ascii="Arial" w:eastAsia="Calibri" w:hAnsi="Arial" w:cs="Arial"/>
-              <w:i/>
               <w:sz w:val="24"/>
               <w:szCs w:val="24"/>
             </w:rPr>
@@ -1424,7 +1421,6 @@
           <m:r>
             <w:rPr>
               <w:rFonts w:ascii="Arial" w:eastAsia="Calibri" w:hAnsi="Arial" w:cs="Arial"/>
-              <w:i/>
               <w:sz w:val="24"/>
               <w:szCs w:val="24"/>
               <w:lang w:val="es-MX"/>
@@ -1486,25 +1482,7 @@
           <w:sz w:val="24"/>
           <w:szCs w:val="24"/>
         </w:rPr>
-        <w:t xml:space="preserve">La diferencia entre dos conjuntos contiene los elementos que pertenecen a </w:t>
-      </w:r>
-      <w:proofErr w:type="gramStart"/>
-      <w:r>
-        <w:rPr>
-          <w:rFonts w:ascii="Arial" w:eastAsia="Calibri" w:hAnsi="Arial" w:cs="Arial"/>
-          <w:sz w:val="24"/>
-          <w:szCs w:val="24"/>
-        </w:rPr>
-        <w:t>uno</w:t>
-      </w:r>
-      <w:proofErr w:type="gramEnd"/>
-      <w:r>
-        <w:rPr>
-          <w:rFonts w:ascii="Arial" w:eastAsia="Calibri" w:hAnsi="Arial" w:cs="Arial"/>
-          <w:sz w:val="24"/>
-          <w:szCs w:val="24"/>
-        </w:rPr>
-        <w:t xml:space="preserve"> pero no al otro.</w:t>
+        <w:t>La diferencia entre dos conjuntos contiene los elementos que pertenecen a uno pero no al otro.</w:t>
       </w:r>
     </w:p>
     <w:p>
@@ -1568,7 +1546,6 @@
           <m:r>
             <w:rPr>
               <w:rFonts w:ascii="Arial" w:eastAsia="Calibri" w:hAnsi="Arial" w:cs="Arial"/>
-              <w:i/>
               <w:sz w:val="24"/>
               <w:szCs w:val="24"/>
             </w:rPr>
@@ -1674,7 +1651,6 @@
           <m:r>
             <w:rPr>
               <w:rFonts w:ascii="Arial" w:eastAsia="Calibri" w:hAnsi="Arial" w:cs="Arial"/>
-              <w:i/>
               <w:sz w:val="24"/>
               <w:szCs w:val="24"/>
               <w:lang w:val="es-MX"/>
@@ -2013,7 +1989,6 @@
           <m:r>
             <w:rPr>
               <w:rFonts w:ascii="Arial" w:eastAsia="Calibri" w:hAnsi="Arial" w:cs="Arial"/>
-              <w:i/>
               <w:sz w:val="24"/>
               <w:szCs w:val="24"/>
               <w:lang w:val="es-MX"/>
@@ -2078,23 +2053,7 @@
           <w:sz w:val="24"/>
           <w:szCs w:val="24"/>
         </w:rPr>
-        <w:t>Utilizaremos el lenguaje de programación Python. Sabemos que este lenguaje, en su librería base, ya incluye una estructura especial de datos para manejar conjuntos, llamada sets. Incluso, ya vienen programados métodos y operadores que permiten realizar todas las operaciones de conjuntos anteriormente descritas.</w:t>
-      </w:r>
-      <w:r>
-        <w:rPr>
-          <w:rFonts w:ascii="Arial" w:eastAsia="Calibri" w:hAnsi="Arial" w:cs="Arial"/>
-          <w:sz w:val="24"/>
-          <w:szCs w:val="24"/>
-        </w:rPr>
-        <w:t xml:space="preserve"> </w:t>
-      </w:r>
-      <w:r>
-        <w:rPr>
-          <w:rFonts w:ascii="Arial" w:eastAsia="Calibri" w:hAnsi="Arial" w:cs="Arial"/>
-          <w:sz w:val="24"/>
-          <w:szCs w:val="24"/>
-        </w:rPr>
-        <w:t>(Gómez Salgado, 2024).</w:t>
+        <w:t>Utilizaremos el lenguaje de programación Python. Sabemos que este lenguaje, en su librería base, ya incluye una estructura especial de datos para manejar conjuntos, llamada sets. Incluso, ya vienen programados métodos y operadores que permiten realizar todas las operaciones de conjuntos anteriormente descritas. (Gómez Salgado, 2024).</w:t>
       </w:r>
     </w:p>
     <w:p>
@@ -2227,6 +2186,15 @@
         </w:rPr>
         <w:t xml:space="preserve">Primero definimos que </w:t>
       </w:r>
+      <w:r>
+        <w:rPr>
+          <w:rFonts w:ascii="Arial" w:eastAsia="Calibri" w:hAnsi="Arial" w:cs="Arial"/>
+          <w:sz w:val="24"/>
+          <w:szCs w:val="24"/>
+          <w:lang w:val="es-MX"/>
+        </w:rPr>
+        <w:t>parámetros se necesitan para inicializar la clase, en este caso recibirá 3 listas:</w:t>
+      </w:r>
     </w:p>
     <w:p>
       <w:pPr>
@@ -2251,6 +2219,51 @@
           <w:lang w:val="es-MX"/>
         </w:rPr>
       </w:pPr>
+      <w:r>
+        <w:rPr>
+          <w:rFonts w:ascii="Arial" w:eastAsia="Calibri" w:hAnsi="Arial" w:cs="Arial"/>
+          <w:noProof/>
+          <w:sz w:val="24"/>
+          <w:szCs w:val="24"/>
+          <w:lang w:val="es-MX"/>
+        </w:rPr>
+        <w:lastRenderedPageBreak/>
+        <w:drawing>
+          <wp:inline distT="0" distB="0" distL="0" distR="0" wp14:anchorId="7A7E95FD" wp14:editId="654CFE86">
+            <wp:extent cx="4039164" cy="1000265"/>
+            <wp:effectExtent l="0" t="0" r="0" b="9525"/>
+            <wp:docPr id="1838483426" name="Imagen 1"/>
+            <wp:cNvGraphicFramePr>
+              <a:graphicFrameLocks xmlns:a="http://schemas.openxmlformats.org/drawingml/2006/main" noChangeAspect="1"/>
+            </wp:cNvGraphicFramePr>
+            <a:graphic xmlns:a="http://schemas.openxmlformats.org/drawingml/2006/main">
+              <a:graphicData uri="http://schemas.openxmlformats.org/drawingml/2006/picture">
+                <pic:pic xmlns:pic="http://schemas.openxmlformats.org/drawingml/2006/picture">
+                  <pic:nvPicPr>
+                    <pic:cNvPr id="1838483426" name=""/>
+                    <pic:cNvPicPr/>
+                  </pic:nvPicPr>
+                  <pic:blipFill>
+                    <a:blip r:embed="rId11"/>
+                    <a:stretch>
+                      <a:fillRect/>
+                    </a:stretch>
+                  </pic:blipFill>
+                  <pic:spPr>
+                    <a:xfrm>
+                      <a:off x="0" y="0"/>
+                      <a:ext cx="4039164" cy="1000265"/>
+                    </a:xfrm>
+                    <a:prstGeom prst="rect">
+                      <a:avLst/>
+                    </a:prstGeom>
+                  </pic:spPr>
+                </pic:pic>
+              </a:graphicData>
+            </a:graphic>
+          </wp:inline>
+        </w:drawing>
+      </w:r>
     </w:p>
     <w:p>
       <w:pPr>
@@ -2275,6 +2288,112 @@
           <w:lang w:val="es-MX"/>
         </w:rPr>
       </w:pPr>
+    </w:p>
+    <w:p>
+      <w:pPr>
+        <w:pStyle w:val="Prrafodelista"/>
+        <w:spacing w:after="0" w:line="276" w:lineRule="auto"/>
+        <w:rPr>
+          <w:rFonts w:ascii="Arial" w:eastAsia="Calibri" w:hAnsi="Arial" w:cs="Arial"/>
+          <w:sz w:val="24"/>
+          <w:szCs w:val="24"/>
+          <w:lang w:val="es-MX"/>
+        </w:rPr>
+      </w:pPr>
+      <w:r>
+        <w:rPr>
+          <w:rFonts w:ascii="Arial" w:eastAsia="Calibri" w:hAnsi="Arial" w:cs="Arial"/>
+          <w:sz w:val="24"/>
+          <w:szCs w:val="24"/>
+          <w:lang w:val="es-MX"/>
+        </w:rPr>
+        <w:t xml:space="preserve">Posteriormente </w:t>
+      </w:r>
+      <w:r>
+        <w:rPr>
+          <w:rFonts w:ascii="Arial" w:eastAsia="Calibri" w:hAnsi="Arial" w:cs="Arial"/>
+          <w:sz w:val="24"/>
+          <w:szCs w:val="24"/>
+          <w:lang w:val="es-MX"/>
+        </w:rPr>
+        <w:t xml:space="preserve">vamos a programar los métodos que tendrá nuestro objeto </w:t>
+      </w:r>
+      <w:r>
+        <w:rPr>
+          <w:rFonts w:ascii="Arial" w:eastAsia="Calibri" w:hAnsi="Arial" w:cs="Arial"/>
+          <w:sz w:val="24"/>
+          <w:szCs w:val="24"/>
+          <w:lang w:val="es-MX"/>
+        </w:rPr>
+        <w:t>así como los parámetros que necesita para ejecutarse.</w:t>
+      </w:r>
+    </w:p>
+    <w:p>
+      <w:pPr>
+        <w:pStyle w:val="Prrafodelista"/>
+        <w:spacing w:after="0" w:line="276" w:lineRule="auto"/>
+        <w:rPr>
+          <w:rFonts w:ascii="Arial" w:eastAsia="Calibri" w:hAnsi="Arial" w:cs="Arial"/>
+          <w:sz w:val="24"/>
+          <w:szCs w:val="24"/>
+          <w:lang w:val="es-MX"/>
+        </w:rPr>
+      </w:pPr>
+    </w:p>
+    <w:p>
+      <w:pPr>
+        <w:pStyle w:val="Prrafodelista"/>
+        <w:spacing w:after="0" w:line="276" w:lineRule="auto"/>
+        <w:rPr>
+          <w:rFonts w:ascii="Arial" w:eastAsia="Calibri" w:hAnsi="Arial" w:cs="Arial"/>
+          <w:sz w:val="24"/>
+          <w:szCs w:val="24"/>
+          <w:lang w:val="es-MX"/>
+        </w:rPr>
+      </w:pPr>
+      <w:r>
+        <w:rPr>
+          <w:rFonts w:ascii="Arial" w:eastAsia="Calibri" w:hAnsi="Arial" w:cs="Arial"/>
+          <w:sz w:val="24"/>
+          <w:szCs w:val="24"/>
+          <w:lang w:val="es-MX"/>
+        </w:rPr>
+        <w:drawing>
+          <wp:inline distT="0" distB="0" distL="0" distR="0" wp14:anchorId="64F7A835" wp14:editId="38EDFD4B">
+            <wp:extent cx="5850890" cy="2715895"/>
+            <wp:effectExtent l="0" t="0" r="0" b="8255"/>
+            <wp:docPr id="827729757" name="Imagen 1"/>
+            <wp:cNvGraphicFramePr>
+              <a:graphicFrameLocks xmlns:a="http://schemas.openxmlformats.org/drawingml/2006/main" noChangeAspect="1"/>
+            </wp:cNvGraphicFramePr>
+            <a:graphic xmlns:a="http://schemas.openxmlformats.org/drawingml/2006/main">
+              <a:graphicData uri="http://schemas.openxmlformats.org/drawingml/2006/picture">
+                <pic:pic xmlns:pic="http://schemas.openxmlformats.org/drawingml/2006/picture">
+                  <pic:nvPicPr>
+                    <pic:cNvPr id="827729757" name=""/>
+                    <pic:cNvPicPr/>
+                  </pic:nvPicPr>
+                  <pic:blipFill>
+                    <a:blip r:embed="rId12"/>
+                    <a:stretch>
+                      <a:fillRect/>
+                    </a:stretch>
+                  </pic:blipFill>
+                  <pic:spPr>
+                    <a:xfrm>
+                      <a:off x="0" y="0"/>
+                      <a:ext cx="5850890" cy="2715895"/>
+                    </a:xfrm>
+                    <a:prstGeom prst="rect">
+                      <a:avLst/>
+                    </a:prstGeom>
+                  </pic:spPr>
+                </pic:pic>
+              </a:graphicData>
+            </a:graphic>
+          </wp:inline>
+        </w:drawing>
+      </w:r>
     </w:p>
     <w:p>
       <w:pPr>
@@ -2322,6 +2441,7 @@
           <w:rFonts w:ascii="Arial" w:eastAsia="Calibri" w:hAnsi="Arial" w:cs="Arial"/>
           <w:sz w:val="24"/>
           <w:szCs w:val="24"/>
+          <w:lang w:val="en-US"/>
         </w:rPr>
       </w:pPr>
       <w:r>
@@ -2373,7 +2493,7 @@
         </w:rPr>
         <w:t xml:space="preserve">. </w:t>
       </w:r>
-      <w:hyperlink r:id="rId11" w:tgtFrame="_new" w:history="1">
+      <w:hyperlink r:id="rId13" w:tgtFrame="_new" w:history="1">
         <w:r>
           <w:rPr>
             <w:rStyle w:val="Hipervnculo"/>
@@ -2395,6 +2515,7 @@
           <w:rFonts w:ascii="Arial" w:eastAsia="Calibri" w:hAnsi="Arial" w:cs="Arial"/>
           <w:sz w:val="24"/>
           <w:szCs w:val="24"/>
+          <w:lang w:val="en-US"/>
         </w:rPr>
       </w:pPr>
     </w:p>
@@ -2441,8 +2562,8 @@
       </w:r>
     </w:p>
     <w:sectPr>
-      <w:headerReference w:type="default" r:id="rId12"/>
-      <w:footerReference w:type="default" r:id="rId13"/>
+      <w:headerReference w:type="default" r:id="rId14"/>
+      <w:footerReference w:type="default" r:id="rId15"/>
       <w:pgSz w:w="12240" w:h="15840"/>
       <w:pgMar w:top="1417" w:right="1325" w:bottom="1417" w:left="1701" w:header="708" w:footer="708" w:gutter="0"/>
       <w:cols w:space="708"/>
@@ -7966,6 +8087,7 @@
   <w:style w:type="character" w:default="1" w:styleId="Fuentedeprrafopredeter">
     <w:name w:val="Default Paragraph Font"/>
     <w:uiPriority w:val="1"/>
+    <w:semiHidden/>
     <w:unhideWhenUsed/>
   </w:style>
   <w:style w:type="table" w:default="1" w:styleId="Tablanormal">
@@ -8723,24 +8845,6 @@
 </file>
 
 <file path=customXml/item1.xml><?xml version="1.0" encoding="utf-8"?>
-<?mso-contentType ?>
-<FormTemplates xmlns="http://schemas.microsoft.com/sharepoint/v3/contenttype/forms">
-  <Display>DocumentLibraryForm</Display>
-  <Edit>DocumentLibraryForm</Edit>
-  <New>DocumentLibraryForm</New>
-</FormTemplates>
-</file>
-
-<file path=customXml/item2.xml><?xml version="1.0" encoding="utf-8"?>
-<p:properties xmlns:p="http://schemas.microsoft.com/office/2006/metadata/properties" xmlns:xsi="http://www.w3.org/2001/XMLSchema-instance" xmlns:pc="http://schemas.microsoft.com/office/infopath/2007/PartnerControls">
-  <documentManagement>
-    <Fecha_x0020_y_x0020_hora xmlns="11db57f7-d5ba-4b16-ae4b-c02c09c3f27a" xsi:nil="true"/>
-    <Fecha xmlns="11db57f7-d5ba-4b16-ae4b-c02c09c3f27a" xsi:nil="true"/>
-  </documentManagement>
-</p:properties>
-</file>
-
-<file path=customXml/item3.xml><?xml version="1.0" encoding="utf-8"?>
 <ct:contentTypeSchema xmlns:ct="http://schemas.microsoft.com/office/2006/metadata/contentType" xmlns:ma="http://schemas.microsoft.com/office/2006/metadata/properties/metaAttributes" ct:_="" ma:_="" ma:contentTypeName="Documento" ma:contentTypeID="0x010100544D8808B6210A459B209D85BB868FC9" ma:contentTypeVersion="14" ma:contentTypeDescription="Crear nuevo documento." ma:contentTypeScope="" ma:versionID="6aabf6165f9991f135bfe92e3d8132e6">
   <xsd:schema xmlns:xsd="http://www.w3.org/2001/XMLSchema" xmlns:xs="http://www.w3.org/2001/XMLSchema" xmlns:p="http://schemas.microsoft.com/office/2006/metadata/properties" xmlns:ns2="11db57f7-d5ba-4b16-ae4b-c02c09c3f27a" xmlns:ns3="64ced8be-9932-4095-a3e3-0253322bd008" targetNamespace="http://schemas.microsoft.com/office/2006/metadata/properties" ma:root="true" ma:fieldsID="eb1956448ad72b0242856817a13a5f98" ns2:_="" ns3:_="">
     <xsd:import namespace="11db57f7-d5ba-4b16-ae4b-c02c09c3f27a"/>
@@ -8969,29 +9073,29 @@
 </ct:contentTypeSchema>
 </file>
 
+<file path=customXml/item2.xml><?xml version="1.0" encoding="utf-8"?>
+<p:properties xmlns:p="http://schemas.microsoft.com/office/2006/metadata/properties" xmlns:xsi="http://www.w3.org/2001/XMLSchema-instance" xmlns:pc="http://schemas.microsoft.com/office/infopath/2007/PartnerControls">
+  <documentManagement>
+    <Fecha_x0020_y_x0020_hora xmlns="11db57f7-d5ba-4b16-ae4b-c02c09c3f27a" xsi:nil="true"/>
+    <Fecha xmlns="11db57f7-d5ba-4b16-ae4b-c02c09c3f27a" xsi:nil="true"/>
+  </documentManagement>
+</p:properties>
+</file>
+
+<file path=customXml/item3.xml><?xml version="1.0" encoding="utf-8"?>
+<?mso-contentType ?>
+<FormTemplates xmlns="http://schemas.microsoft.com/sharepoint/v3/contenttype/forms">
+  <Display>DocumentLibraryForm</Display>
+  <Edit>DocumentLibraryForm</Edit>
+  <New>DocumentLibraryForm</New>
+</FormTemplates>
+</file>
+
 <file path=customXml/item4.xml><?xml version="1.0" encoding="utf-8"?>
 <b:Sources xmlns:b="http://schemas.openxmlformats.org/officeDocument/2006/bibliography" xmlns="http://schemas.openxmlformats.org/officeDocument/2006/bibliography" SelectedStyle="\APASixthEditionOfficeOnline.xsl" StyleName="APA" Version="6"/>
 </file>
 
 <file path=customXml/itemProps1.xml><?xml version="1.0" encoding="utf-8"?>
-<ds:datastoreItem xmlns:ds="http://schemas.openxmlformats.org/officeDocument/2006/customXml" ds:itemID="{110781A1-A327-4B5B-94CF-9FECAC6B1002}">
-  <ds:schemaRefs>
-    <ds:schemaRef ds:uri="http://schemas.microsoft.com/sharepoint/v3/contenttype/forms"/>
-  </ds:schemaRefs>
-</ds:datastoreItem>
-</file>
-
-<file path=customXml/itemProps2.xml><?xml version="1.0" encoding="utf-8"?>
-<ds:datastoreItem xmlns:ds="http://schemas.openxmlformats.org/officeDocument/2006/customXml" ds:itemID="{3315B37B-3576-4A1B-81E0-09169ABE570B}">
-  <ds:schemaRefs>
-    <ds:schemaRef ds:uri="http://schemas.microsoft.com/office/2006/metadata/properties"/>
-    <ds:schemaRef ds:uri="http://schemas.microsoft.com/office/infopath/2007/PartnerControls"/>
-    <ds:schemaRef ds:uri="11db57f7-d5ba-4b16-ae4b-c02c09c3f27a"/>
-  </ds:schemaRefs>
-</ds:datastoreItem>
-</file>
-
-<file path=customXml/itemProps3.xml><?xml version="1.0" encoding="utf-8"?>
 <ds:datastoreItem xmlns:ds="http://schemas.openxmlformats.org/officeDocument/2006/customXml" ds:itemID="{9A47681F-191E-40E4-BF63-6E7096F01C35}">
   <ds:schemaRefs>
     <ds:schemaRef ds:uri="http://schemas.microsoft.com/office/2006/metadata/contentType"/>
@@ -9010,6 +9114,24 @@
 </ds:datastoreItem>
 </file>
 
+<file path=customXml/itemProps2.xml><?xml version="1.0" encoding="utf-8"?>
+<ds:datastoreItem xmlns:ds="http://schemas.openxmlformats.org/officeDocument/2006/customXml" ds:itemID="{3315B37B-3576-4A1B-81E0-09169ABE570B}">
+  <ds:schemaRefs>
+    <ds:schemaRef ds:uri="http://schemas.microsoft.com/office/2006/metadata/properties"/>
+    <ds:schemaRef ds:uri="http://schemas.microsoft.com/office/infopath/2007/PartnerControls"/>
+    <ds:schemaRef ds:uri="11db57f7-d5ba-4b16-ae4b-c02c09c3f27a"/>
+  </ds:schemaRefs>
+</ds:datastoreItem>
+</file>
+
+<file path=customXml/itemProps3.xml><?xml version="1.0" encoding="utf-8"?>
+<ds:datastoreItem xmlns:ds="http://schemas.openxmlformats.org/officeDocument/2006/customXml" ds:itemID="{110781A1-A327-4B5B-94CF-9FECAC6B1002}">
+  <ds:schemaRefs>
+    <ds:schemaRef ds:uri="http://schemas.microsoft.com/sharepoint/v3/contenttype/forms"/>
+  </ds:schemaRefs>
+</ds:datastoreItem>
+</file>
+
 <file path=customXml/itemProps4.xml><?xml version="1.0" encoding="utf-8"?>
 <ds:datastoreItem xmlns:ds="http://schemas.openxmlformats.org/officeDocument/2006/customXml" ds:itemID="{FFAA7AF3-D6DC-4233-8750-6D4CA6C44CF3}">
   <ds:schemaRefs>

</xml_diff>